<commit_message>
Modified Scenarios To Be More Vague
</commit_message>
<xml_diff>
--- a/Task3a_Observations_LL-000020908_Ram_D.docx
+++ b/Task3a_Observations_LL-000020908_Ram_D.docx
@@ -1,6 +1,6 @@
 
 <file path=word/document.xml><?xml version="1.0" encoding="utf-8"?>
-<w:document xmlns:wpc="http://schemas.microsoft.com/office/word/2010/wordprocessingCanvas" xmlns:cx="http://schemas.microsoft.com/office/drawing/2014/chartex" xmlns:cx1="http://schemas.microsoft.com/office/drawing/2015/9/8/chartex" xmlns:cx2="http://schemas.microsoft.com/office/drawing/2015/10/21/chartex" xmlns:cx3="http://schemas.microsoft.com/office/drawing/2016/5/9/chartex" xmlns:cx4="http://schemas.microsoft.com/office/drawing/2016/5/10/chartex" xmlns:cx5="http://schemas.microsoft.com/office/drawing/2016/5/11/chartex" xmlns:cx6="http://schemas.microsoft.com/office/drawing/2016/5/12/chartex" xmlns:cx7="http://schemas.microsoft.com/office/drawing/2016/5/13/chartex" xmlns:cx8="http://schemas.microsoft.com/office/drawing/2016/5/14/chartex" xmlns:mc="http://schemas.openxmlformats.org/markup-compatibility/2006" xmlns:aink="http://schemas.microsoft.com/office/drawing/2016/ink" xmlns:am3d="http://schemas.microsoft.com/office/drawing/2017/model3d" xmlns:o="urn:schemas-microsoft-com:office:office" xmlns:oel="http://schemas.microsoft.com/office/2019/extlst" xmlns:r="http://schemas.openxmlformats.org/officeDocument/2006/relationships" xmlns:m="http://schemas.openxmlformats.org/officeDocument/2006/math" xmlns:v="urn:schemas-microsoft-com:vml" xmlns:wp14="http://schemas.microsoft.com/office/word/2010/wordprocessingDrawing" xmlns:wp="http://schemas.openxmlformats.org/drawingml/2006/wordprocessingDrawing" xmlns:w10="urn:schemas-microsoft-com:office:word" xmlns:w="http://schemas.openxmlformats.org/wordprocessingml/2006/main" xmlns:w14="http://schemas.microsoft.com/office/word/2010/wordml" xmlns:w15="http://schemas.microsoft.com/office/word/2012/wordml" xmlns:w16cex="http://schemas.microsoft.com/office/word/2018/wordml/cex" xmlns:w16cid="http://schemas.microsoft.com/office/word/2016/wordml/cid" xmlns:w16="http://schemas.microsoft.com/office/word/2018/wordml" xmlns:w16du="http://schemas.microsoft.com/office/word/2023/wordml/word16du" xmlns:w16sdtdh="http://schemas.microsoft.com/office/word/2020/wordml/sdtdatahash" xmlns:w16sdtfl="http://schemas.microsoft.com/office/word/2024/wordml/sdtformatlock" xmlns:w16se="http://schemas.microsoft.com/office/word/2015/wordml/symex" xmlns:wpg="http://schemas.microsoft.com/office/word/2010/wordprocessingGroup" xmlns:wpi="http://schemas.microsoft.com/office/word/2010/wordprocessingInk" xmlns:wne="http://schemas.microsoft.com/office/word/2006/wordml" xmlns:wps="http://schemas.microsoft.com/office/word/2010/wordprocessingShape" mc:Ignorable="w14 w15 w16se w16cid w16 w16cex w16sdtdh w16sdtfl w16du wp14">
+<w:document xmlns:wpc="http://schemas.microsoft.com/office/word/2010/wordprocessingCanvas" xmlns:cx="http://schemas.microsoft.com/office/drawing/2014/chartex" xmlns:cx1="http://schemas.microsoft.com/office/drawing/2015/9/8/chartex" xmlns:cx2="http://schemas.microsoft.com/office/drawing/2015/10/21/chartex" xmlns:cx3="http://schemas.microsoft.com/office/drawing/2016/5/9/chartex" xmlns:cx4="http://schemas.microsoft.com/office/drawing/2016/5/10/chartex" xmlns:cx5="http://schemas.microsoft.com/office/drawing/2016/5/11/chartex" xmlns:cx6="http://schemas.microsoft.com/office/drawing/2016/5/12/chartex" xmlns:cx7="http://schemas.microsoft.com/office/drawing/2016/5/13/chartex" xmlns:cx8="http://schemas.microsoft.com/office/drawing/2016/5/14/chartex" xmlns:mc="http://schemas.openxmlformats.org/markup-compatibility/2006" xmlns:aink="http://schemas.microsoft.com/office/drawing/2016/ink" xmlns:am3d="http://schemas.microsoft.com/office/drawing/2017/model3d" xmlns:o="urn:schemas-microsoft-com:office:office" xmlns:r="http://schemas.openxmlformats.org/officeDocument/2006/relationships" xmlns:m="http://schemas.openxmlformats.org/officeDocument/2006/math" xmlns:v="urn:schemas-microsoft-com:vml" xmlns:wp14="http://schemas.microsoft.com/office/word/2010/wordprocessingDrawing" xmlns:wp="http://schemas.openxmlformats.org/drawingml/2006/wordprocessingDrawing" xmlns:w10="urn:schemas-microsoft-com:office:word" xmlns:w="http://schemas.openxmlformats.org/wordprocessingml/2006/main" xmlns:w14="http://schemas.microsoft.com/office/word/2010/wordml" xmlns:w15="http://schemas.microsoft.com/office/word/2012/wordml" xmlns:w16cex="http://schemas.microsoft.com/office/word/2018/wordml/cex" xmlns:w16cid="http://schemas.microsoft.com/office/word/2016/wordml/cid" xmlns:w16="http://schemas.microsoft.com/office/word/2018/wordml" xmlns:w16sdtdh="http://schemas.microsoft.com/office/word/2020/wordml/sdtdatahash" xmlns:w16se="http://schemas.microsoft.com/office/word/2015/wordml/symex" xmlns:wpg="http://schemas.microsoft.com/office/word/2010/wordprocessingGroup" xmlns:wpi="http://schemas.microsoft.com/office/word/2010/wordprocessingInk" xmlns:wne="http://schemas.microsoft.com/office/word/2006/wordml" xmlns:wps="http://schemas.microsoft.com/office/word/2010/wordprocessingShape" mc:Ignorable="w14 w15 w16se w16cid w16 w16cex w16sdtdh wp14">
   <w:body>
     <w:p>
       <w:pPr>
@@ -78,7 +78,7 @@
         <w:t xml:space="preserve">the </w:t>
       </w:r>
       <w:r>
-        <w:t>basket from the products’ page using the ‘ADD’ button with the quantity of 20</w:t>
+        <w:t>basket from the products’ page with the quantity of 20</w:t>
       </w:r>
       <w:r>
         <w:t>, and ensure the quantity is changed by inputting it to the text input</w:t>
@@ -144,13 +144,7 @@
         <w:t>s</w:t>
       </w:r>
       <w:r>
-        <w:t xml:space="preserve"> in the products’ page using the stock and city </w:t>
-      </w:r>
-      <w:r>
-        <w:t xml:space="preserve">(2 cities checked) </w:t>
-      </w:r>
-      <w:r>
-        <w:t>filters</w:t>
+        <w:t xml:space="preserve"> in the products’ page using the stock and city filters</w:t>
       </w:r>
     </w:p>
     <w:p>
@@ -163,9 +157,6 @@
       </w:pPr>
       <w:r>
         <w:t>Increase the quantity of a product on the ‘My Basket’ page by 4</w:t>
-      </w:r>
-      <w:r>
-        <w:t>, use the plus button to increment the quantity</w:t>
       </w:r>
     </w:p>
     <w:p>
@@ -531,6 +522,9 @@
             <w:r>
               <w:t>3</w:t>
             </w:r>
+            <w:r>
+              <w:t xml:space="preserve"> to 5</w:t>
+            </w:r>
           </w:p>
         </w:tc>
         <w:tc>
@@ -625,7 +619,7 @@
 </file>
 
 <file path=word/numbering.xml><?xml version="1.0" encoding="utf-8"?>
-<w:numbering xmlns:wpc="http://schemas.microsoft.com/office/word/2010/wordprocessingCanvas" xmlns:cx="http://schemas.microsoft.com/office/drawing/2014/chartex" xmlns:cx1="http://schemas.microsoft.com/office/drawing/2015/9/8/chartex" xmlns:cx2="http://schemas.microsoft.com/office/drawing/2015/10/21/chartex" xmlns:cx3="http://schemas.microsoft.com/office/drawing/2016/5/9/chartex" xmlns:cx4="http://schemas.microsoft.com/office/drawing/2016/5/10/chartex" xmlns:cx5="http://schemas.microsoft.com/office/drawing/2016/5/11/chartex" xmlns:cx6="http://schemas.microsoft.com/office/drawing/2016/5/12/chartex" xmlns:cx7="http://schemas.microsoft.com/office/drawing/2016/5/13/chartex" xmlns:cx8="http://schemas.microsoft.com/office/drawing/2016/5/14/chartex" xmlns:mc="http://schemas.openxmlformats.org/markup-compatibility/2006" xmlns:aink="http://schemas.microsoft.com/office/drawing/2016/ink" xmlns:am3d="http://schemas.microsoft.com/office/drawing/2017/model3d" xmlns:o="urn:schemas-microsoft-com:office:office" xmlns:oel="http://schemas.microsoft.com/office/2019/extlst" xmlns:r="http://schemas.openxmlformats.org/officeDocument/2006/relationships" xmlns:m="http://schemas.openxmlformats.org/officeDocument/2006/math" xmlns:v="urn:schemas-microsoft-com:vml" xmlns:wp14="http://schemas.microsoft.com/office/word/2010/wordprocessingDrawing" xmlns:wp="http://schemas.openxmlformats.org/drawingml/2006/wordprocessingDrawing" xmlns:w10="urn:schemas-microsoft-com:office:word" xmlns:w="http://schemas.openxmlformats.org/wordprocessingml/2006/main" xmlns:w14="http://schemas.microsoft.com/office/word/2010/wordml" xmlns:w15="http://schemas.microsoft.com/office/word/2012/wordml" xmlns:w16cex="http://schemas.microsoft.com/office/word/2018/wordml/cex" xmlns:w16cid="http://schemas.microsoft.com/office/word/2016/wordml/cid" xmlns:w16="http://schemas.microsoft.com/office/word/2018/wordml" xmlns:w16du="http://schemas.microsoft.com/office/word/2023/wordml/word16du" xmlns:w16sdtdh="http://schemas.microsoft.com/office/word/2020/wordml/sdtdatahash" xmlns:w16sdtfl="http://schemas.microsoft.com/office/word/2024/wordml/sdtformatlock" xmlns:w16se="http://schemas.microsoft.com/office/word/2015/wordml/symex" xmlns:wpg="http://schemas.microsoft.com/office/word/2010/wordprocessingGroup" xmlns:wpi="http://schemas.microsoft.com/office/word/2010/wordprocessingInk" xmlns:wne="http://schemas.microsoft.com/office/word/2006/wordml" xmlns:wps="http://schemas.microsoft.com/office/word/2010/wordprocessingShape" mc:Ignorable="w14 w15 w16se w16cid w16 w16cex w16sdtdh w16sdtfl w16du wp14">
+<w:numbering xmlns:wpc="http://schemas.microsoft.com/office/word/2010/wordprocessingCanvas" xmlns:cx="http://schemas.microsoft.com/office/drawing/2014/chartex" xmlns:cx1="http://schemas.microsoft.com/office/drawing/2015/9/8/chartex" xmlns:cx2="http://schemas.microsoft.com/office/drawing/2015/10/21/chartex" xmlns:cx3="http://schemas.microsoft.com/office/drawing/2016/5/9/chartex" xmlns:cx4="http://schemas.microsoft.com/office/drawing/2016/5/10/chartex" xmlns:cx5="http://schemas.microsoft.com/office/drawing/2016/5/11/chartex" xmlns:cx6="http://schemas.microsoft.com/office/drawing/2016/5/12/chartex" xmlns:cx7="http://schemas.microsoft.com/office/drawing/2016/5/13/chartex" xmlns:cx8="http://schemas.microsoft.com/office/drawing/2016/5/14/chartex" xmlns:mc="http://schemas.openxmlformats.org/markup-compatibility/2006" xmlns:aink="http://schemas.microsoft.com/office/drawing/2016/ink" xmlns:am3d="http://schemas.microsoft.com/office/drawing/2017/model3d" xmlns:o="urn:schemas-microsoft-com:office:office" xmlns:r="http://schemas.openxmlformats.org/officeDocument/2006/relationships" xmlns:m="http://schemas.openxmlformats.org/officeDocument/2006/math" xmlns:v="urn:schemas-microsoft-com:vml" xmlns:wp14="http://schemas.microsoft.com/office/word/2010/wordprocessingDrawing" xmlns:wp="http://schemas.openxmlformats.org/drawingml/2006/wordprocessingDrawing" xmlns:w10="urn:schemas-microsoft-com:office:word" xmlns:w="http://schemas.openxmlformats.org/wordprocessingml/2006/main" xmlns:w14="http://schemas.microsoft.com/office/word/2010/wordml" xmlns:w15="http://schemas.microsoft.com/office/word/2012/wordml" xmlns:w16cex="http://schemas.microsoft.com/office/word/2018/wordml/cex" xmlns:w16cid="http://schemas.microsoft.com/office/word/2016/wordml/cid" xmlns:w16="http://schemas.microsoft.com/office/word/2018/wordml" xmlns:w16sdtdh="http://schemas.microsoft.com/office/word/2020/wordml/sdtdatahash" xmlns:w16se="http://schemas.microsoft.com/office/word/2015/wordml/symex" xmlns:wpg="http://schemas.microsoft.com/office/word/2010/wordprocessingGroup" xmlns:wpi="http://schemas.microsoft.com/office/word/2010/wordprocessingInk" xmlns:wne="http://schemas.microsoft.com/office/word/2006/wordml" xmlns:wps="http://schemas.microsoft.com/office/word/2010/wordprocessingShape" mc:Ignorable="w14 w15 w16se w16cid w16 w16cex w16sdtdh wp14">
   <w:abstractNum w:abstractNumId="0" w15:restartNumberingAfterBreak="0">
     <w:nsid w:val="75A33F4F"/>
     <w:multiLevelType w:val="hybridMultilevel"/>
@@ -712,14 +706,14 @@
       </w:pPr>
     </w:lvl>
   </w:abstractNum>
-  <w:num w:numId="1" w16cid:durableId="716584558">
+  <w:num w:numId="1">
     <w:abstractNumId w:val="0"/>
   </w:num>
 </w:numbering>
 </file>
 
 <file path=word/styles.xml><?xml version="1.0" encoding="utf-8"?>
-<w:styles xmlns:mc="http://schemas.openxmlformats.org/markup-compatibility/2006" xmlns:r="http://schemas.openxmlformats.org/officeDocument/2006/relationships" xmlns:w="http://schemas.openxmlformats.org/wordprocessingml/2006/main" xmlns:w14="http://schemas.microsoft.com/office/word/2010/wordml" xmlns:w15="http://schemas.microsoft.com/office/word/2012/wordml" xmlns:w16cex="http://schemas.microsoft.com/office/word/2018/wordml/cex" xmlns:w16cid="http://schemas.microsoft.com/office/word/2016/wordml/cid" xmlns:w16="http://schemas.microsoft.com/office/word/2018/wordml" xmlns:w16du="http://schemas.microsoft.com/office/word/2023/wordml/word16du" xmlns:w16sdtdh="http://schemas.microsoft.com/office/word/2020/wordml/sdtdatahash" xmlns:w16sdtfl="http://schemas.microsoft.com/office/word/2024/wordml/sdtformatlock" xmlns:w16se="http://schemas.microsoft.com/office/word/2015/wordml/symex" mc:Ignorable="w14 w15 w16se w16cid w16 w16cex w16sdtdh w16sdtfl w16du">
+<w:styles xmlns:mc="http://schemas.openxmlformats.org/markup-compatibility/2006" xmlns:r="http://schemas.openxmlformats.org/officeDocument/2006/relationships" xmlns:w="http://schemas.openxmlformats.org/wordprocessingml/2006/main" xmlns:w14="http://schemas.microsoft.com/office/word/2010/wordml" xmlns:w15="http://schemas.microsoft.com/office/word/2012/wordml" xmlns:w16cex="http://schemas.microsoft.com/office/word/2018/wordml/cex" xmlns:w16cid="http://schemas.microsoft.com/office/word/2016/wordml/cid" xmlns:w16="http://schemas.microsoft.com/office/word/2018/wordml" xmlns:w16sdtdh="http://schemas.microsoft.com/office/word/2020/wordml/sdtdatahash" xmlns:w16se="http://schemas.microsoft.com/office/word/2015/wordml/symex" mc:Ignorable="w14 w15 w16se w16cid w16 w16cex w16sdtdh">
   <w:docDefaults>
     <w:rPrDefault>
       <w:rPr>

</xml_diff>